<commit_message>
Add coverage-guided simulados workflow
</commit_message>
<xml_diff>
--- a/docs/provas/geografia/p2/simulados/simulado-p2-geografia-01.docx
+++ b/docs/provas/geografia/p2/simulados/simulado-p2-geografia-01.docx
@@ -73,26 +73,26 @@
           <w:b w:val="0"/>
           <w:sz w:val="22"/>
         </w:rPr>
-        <w:t xml:space="preserve">&gt; O geógrafo Aziz Ab’Saber propôs uma forma de compreender o território brasileiro a partir de grandes unidades naturais da paisagem. Nessas áreas, elementos como clima, relevo, solo, vegetação e hidrografia se relacionam e ajudam a formar características semelhantes.</w:t>
-      </w:r>
-    </w:p>
-    <w:p>
-      <w:pPr>
-        <w:spacing w:before="0" w:after="80" w:line="269" w:lineRule="auto"/>
-      </w:pPr>
-      <w:r>
-        <w:rPr>
-          <w:b w:val="0"/>
-          <w:sz w:val="22"/>
-        </w:rPr>
-        <w:t xml:space="preserve">Com base no trecho e no que foi estudado, </w:t>
-      </w:r>
-      <w:r>
-        <w:rPr>
-          <w:b/>
-          <w:sz w:val="22"/>
-        </w:rPr>
-        <w:t xml:space="preserve">explique o que são domínios morfoclimáticos e cite três elementos naturais usados para caracterizá-los.</w:t>
+        <w:t xml:space="preserve">&gt; O geógrafo Aziz Ab’Saber classificou grandes áreas naturais brasileiras considerando a relação entre clima, vegetação, hidrografia, relevo e solo.</w:t>
+      </w:r>
+    </w:p>
+    <w:p>
+      <w:pPr>
+        <w:spacing w:before="0" w:after="80" w:line="269" w:lineRule="auto"/>
+      </w:pPr>
+      <w:r>
+        <w:rPr>
+          <w:b w:val="0"/>
+          <w:sz w:val="22"/>
+        </w:rPr>
+        <w:t xml:space="preserve">Com base no trecho, </w:t>
+      </w:r>
+      <w:r>
+        <w:rPr>
+          <w:b/>
+          <w:sz w:val="22"/>
+        </w:rPr>
+        <w:t xml:space="preserve">explique o que são domínios morfoclimáticos e cite três elementos naturais usados nessa classificação.</w:t>
       </w:r>
     </w:p>
     <w:p>
@@ -164,7 +164,7 @@
           <w:b w:val="0"/>
           <w:sz w:val="22"/>
         </w:rPr>
-        <w:t xml:space="preserve">Em algumas áreas do território brasileiro, não é possível perceber características totalmente definidas de apenas um domínio morfoclimático, pois há mistura gradual de elementos naturais de domínios diferentes.</w:t>
+        <w:t xml:space="preserve">Em algumas áreas do território brasileiro, é possível perceber características de dois domínios morfoclimáticos diferentes, pois há uma passagem gradual entre eles.</w:t>
       </w:r>
     </w:p>
     <w:p>
@@ -248,19 +248,19 @@
           <w:b w:val="0"/>
           <w:sz w:val="22"/>
         </w:rPr>
-        <w:t xml:space="preserve">&gt; Em uma região do Brasil, as temperaturas são elevadas durante quase todo o ano, a amplitude térmica é baixa e as chuvas são abundantes. Essa área está próxima à Linha do Equador.</w:t>
-      </w:r>
-    </w:p>
-    <w:p>
-      <w:pPr>
-        <w:spacing w:before="0" w:after="80" w:line="269" w:lineRule="auto"/>
-      </w:pPr>
-      <w:r>
-        <w:rPr>
-          <w:b/>
-          <w:sz w:val="22"/>
-        </w:rPr>
-        <w:t xml:space="preserve">Identifique o tipo climático descrito e explique qual fator climático é mais importante para essa característica.</w:t>
+        <w:t xml:space="preserve">&gt; Uma área próxima à Linha do Equador apresenta temperaturas elevadas durante todo o ano, baixa amplitude térmica e chuvas abundantes.</w:t>
+      </w:r>
+    </w:p>
+    <w:p>
+      <w:pPr>
+        <w:spacing w:before="0" w:after="80" w:line="269" w:lineRule="auto"/>
+      </w:pPr>
+      <w:r>
+        <w:rPr>
+          <w:b/>
+          <w:sz w:val="22"/>
+        </w:rPr>
+        <w:t xml:space="preserve">Identifique o clima descrito e explique qual fator climático mais influencia essas características.</w:t>
       </w:r>
     </w:p>
     <w:p>
@@ -320,19 +320,19 @@
           <w:b w:val="0"/>
           <w:sz w:val="22"/>
         </w:rPr>
-        <w:t xml:space="preserve">O clima tropical brasileiro pode apresentar variações conforme diferentes fatores climáticos. Explique a diferença entre:</w:t>
-      </w:r>
-    </w:p>
-    <w:p>
-      <w:pPr>
-        <w:spacing w:before="0" w:after="80" w:line="269" w:lineRule="auto"/>
-      </w:pPr>
-      <w:r>
-        <w:rPr>
-          <w:b/>
-          <w:sz w:val="22"/>
-        </w:rPr>
-        <w:t xml:space="preserve">a. Tropical típico</w:t>
+        <w:t xml:space="preserve">O clima tropical pode aparecer de formas diferentes no Brasil.</w:t>
+      </w:r>
+    </w:p>
+    <w:p>
+      <w:pPr>
+        <w:spacing w:before="0" w:after="80" w:line="269" w:lineRule="auto"/>
+      </w:pPr>
+      <w:r>
+        <w:rPr>
+          <w:b/>
+          <w:sz w:val="22"/>
+        </w:rPr>
+        <w:t xml:space="preserve">Explique a diferença entre tropical típico, tropical litorâneo e tropical de altitude, relacionando cada um ao principal fator climático que o influencia.</w:t>
       </w:r>
     </w:p>
     <w:p>
@@ -361,14 +361,74 @@
     </w:p>
     <w:p>
       <w:pPr>
-        <w:spacing w:before="0" w:after="80" w:line="269" w:lineRule="auto"/>
-      </w:pPr>
-      <w:r>
-        <w:rPr>
-          <w:b/>
-          <w:sz w:val="22"/>
-        </w:rPr>
-        <w:t xml:space="preserve">b. Tropical litorâneo</w:t>
+        <w:spacing w:before="0" w:after="20" w:line="269" w:lineRule="auto"/>
+      </w:pPr>
+      <w:r>
+        <w:rPr>
+          <w:b w:val="0"/>
+          <w:sz w:val="20"/>
+        </w:rPr>
+        <w:t xml:space="preserve">_____________________________________________________________________________________________</w:t>
+      </w:r>
+    </w:p>
+    <w:p>
+      <w:pPr>
+        <w:spacing w:before="0" w:after="20" w:line="269" w:lineRule="auto"/>
+      </w:pPr>
+      <w:r>
+        <w:rPr>
+          <w:b w:val="0"/>
+          <w:sz w:val="20"/>
+        </w:rPr>
+        <w:t xml:space="preserve">_____________________________________________________________________________________________</w:t>
+      </w:r>
+    </w:p>
+    <w:p>
+      <w:pPr>
+        <w:spacing w:before="200" w:after="80" w:line="269" w:lineRule="auto"/>
+      </w:pPr>
+      <w:r>
+        <w:rPr>
+          <w:b/>
+          <w:sz w:val="26"/>
+        </w:rPr>
+        <w:t xml:space="preserve">Questão 05</w:t>
+      </w:r>
+    </w:p>
+    <w:p>
+      <w:pPr>
+        <w:spacing w:before="0" w:after="80" w:line="269" w:lineRule="auto"/>
+      </w:pPr>
+      <w:r>
+        <w:rPr>
+          <w:b w:val="0"/>
+          <w:sz w:val="22"/>
+        </w:rPr>
+        <w:t xml:space="preserve">Leia a situação abaixo:</w:t>
+      </w:r>
+    </w:p>
+    <w:p>
+      <w:pPr>
+        <w:spacing w:before="0" w:after="80" w:line="269" w:lineRule="auto"/>
+      </w:pPr>
+      <w:r>
+        <w:rPr>
+          <w:b w:val="0"/>
+          <w:sz w:val="22"/>
+        </w:rPr>
+        <w:t xml:space="preserve">&gt; Uma cidade do interior apresenta estação seca e estação chuvosa bem marcadas. Já uma cidade litorânea recebe mais umidade do oceano.</w:t>
+      </w:r>
+    </w:p>
+    <w:p>
+      <w:pPr>
+        <w:spacing w:before="0" w:after="80" w:line="269" w:lineRule="auto"/>
+      </w:pPr>
+      <w:r>
+        <w:rPr>
+          <w:b/>
+          <w:sz w:val="22"/>
+        </w:rPr>
+        <w:t xml:space="preserve">Explique como continentalidade e maritimidade ajudam a entender essa diferença.</w:t>
       </w:r>
     </w:p>
     <w:p>
@@ -397,14 +457,62 @@
     </w:p>
     <w:p>
       <w:pPr>
-        <w:spacing w:before="0" w:after="80" w:line="269" w:lineRule="auto"/>
-      </w:pPr>
-      <w:r>
-        <w:rPr>
-          <w:b/>
-          <w:sz w:val="22"/>
-        </w:rPr>
-        <w:t xml:space="preserve">c. Tropical de altitude</w:t>
+        <w:spacing w:before="0" w:after="20" w:line="269" w:lineRule="auto"/>
+      </w:pPr>
+      <w:r>
+        <w:rPr>
+          <w:b w:val="0"/>
+          <w:sz w:val="20"/>
+        </w:rPr>
+        <w:t xml:space="preserve">_____________________________________________________________________________________________</w:t>
+      </w:r>
+    </w:p>
+    <w:p>
+      <w:pPr>
+        <w:spacing w:before="0" w:after="20" w:line="269" w:lineRule="auto"/>
+      </w:pPr>
+      <w:r>
+        <w:rPr>
+          <w:b w:val="0"/>
+          <w:sz w:val="20"/>
+        </w:rPr>
+        <w:t xml:space="preserve">_____________________________________________________________________________________________</w:t>
+      </w:r>
+    </w:p>
+    <w:p>
+      <w:pPr>
+        <w:spacing w:before="200" w:after="80" w:line="269" w:lineRule="auto"/>
+      </w:pPr>
+      <w:r>
+        <w:rPr>
+          <w:b/>
+          <w:sz w:val="26"/>
+        </w:rPr>
+        <w:t xml:space="preserve">Questão 06</w:t>
+      </w:r>
+    </w:p>
+    <w:p>
+      <w:pPr>
+        <w:spacing w:before="0" w:after="80" w:line="269" w:lineRule="auto"/>
+      </w:pPr>
+      <w:r>
+        <w:rPr>
+          <w:b w:val="0"/>
+          <w:sz w:val="22"/>
+        </w:rPr>
+        <w:t xml:space="preserve">O Cerrado é um domínio morfoclimático localizado principalmente no Brasil central. Sua vegetação apresenta adaptações à estação seca.</w:t>
+      </w:r>
+    </w:p>
+    <w:p>
+      <w:pPr>
+        <w:spacing w:before="0" w:after="80" w:line="269" w:lineRule="auto"/>
+      </w:pPr>
+      <w:r>
+        <w:rPr>
+          <w:b/>
+          <w:sz w:val="22"/>
+        </w:rPr>
+        <w:t xml:space="preserve">Cite duas características naturais do Cerrado e dois problemas ambientais que ele enfrenta atualmente.</w:t>
       </w:r>
     </w:p>
     <w:p>
@@ -433,50 +541,74 @@
     </w:p>
     <w:p>
       <w:pPr>
-        <w:spacing w:before="200" w:after="80" w:line="269" w:lineRule="auto"/>
-      </w:pPr>
-      <w:r>
-        <w:rPr>
-          <w:b/>
-          <w:sz w:val="26"/>
-        </w:rPr>
-        <w:t xml:space="preserve">Questão 05</w:t>
-      </w:r>
-    </w:p>
-    <w:p>
-      <w:pPr>
-        <w:spacing w:before="0" w:after="80" w:line="269" w:lineRule="auto"/>
-      </w:pPr>
-      <w:r>
-        <w:rPr>
-          <w:b w:val="0"/>
-          <w:sz w:val="22"/>
-        </w:rPr>
-        <w:t xml:space="preserve">Observe a situação:</w:t>
-      </w:r>
-    </w:p>
-    <w:p>
-      <w:pPr>
-        <w:spacing w:before="0" w:after="80" w:line="269" w:lineRule="auto"/>
-      </w:pPr>
-      <w:r>
-        <w:rPr>
-          <w:b w:val="0"/>
-          <w:sz w:val="22"/>
-        </w:rPr>
-        <w:t xml:space="preserve">&gt; Uma cidade localizada no interior do Brasil apresenta uma estação seca bem marcada e uma estação chuvosa bem definida. Outra cidade, localizada no litoral, recebe mais umidade do oceano ao longo do ano.</w:t>
-      </w:r>
-    </w:p>
-    <w:p>
-      <w:pPr>
-        <w:spacing w:before="0" w:after="80" w:line="269" w:lineRule="auto"/>
-      </w:pPr>
-      <w:r>
-        <w:rPr>
-          <w:b/>
-          <w:sz w:val="22"/>
-        </w:rPr>
-        <w:t xml:space="preserve">Explique como a continentalidade e a maritimidade influenciam os climas descritos.</w:t>
+        <w:spacing w:before="0" w:after="20" w:line="269" w:lineRule="auto"/>
+      </w:pPr>
+      <w:r>
+        <w:rPr>
+          <w:b w:val="0"/>
+          <w:sz w:val="20"/>
+        </w:rPr>
+        <w:t xml:space="preserve">_____________________________________________________________________________________________</w:t>
+      </w:r>
+    </w:p>
+    <w:p>
+      <w:pPr>
+        <w:spacing w:before="0" w:after="20" w:line="269" w:lineRule="auto"/>
+      </w:pPr>
+      <w:r>
+        <w:rPr>
+          <w:b w:val="0"/>
+          <w:sz w:val="20"/>
+        </w:rPr>
+        <w:t xml:space="preserve">_____________________________________________________________________________________________</w:t>
+      </w:r>
+    </w:p>
+    <w:p>
+      <w:pPr>
+        <w:spacing w:before="200" w:after="80" w:line="269" w:lineRule="auto"/>
+      </w:pPr>
+      <w:r>
+        <w:rPr>
+          <w:b/>
+          <w:sz w:val="26"/>
+        </w:rPr>
+        <w:t xml:space="preserve">Questão 07</w:t>
+      </w:r>
+    </w:p>
+    <w:p>
+      <w:pPr>
+        <w:spacing w:before="0" w:after="80" w:line="269" w:lineRule="auto"/>
+      </w:pPr>
+      <w:r>
+        <w:rPr>
+          <w:b w:val="0"/>
+          <w:sz w:val="22"/>
+        </w:rPr>
+        <w:t xml:space="preserve">Leia o trecho abaixo:</w:t>
+      </w:r>
+    </w:p>
+    <w:p>
+      <w:pPr>
+        <w:spacing w:before="0" w:after="80" w:line="269" w:lineRule="auto"/>
+      </w:pPr>
+      <w:r>
+        <w:rPr>
+          <w:b w:val="0"/>
+          <w:sz w:val="22"/>
+        </w:rPr>
+        <w:t xml:space="preserve">&gt; Quanto mais distante uma área está da Linha do Equador, menor tende a ser a incidência direta dos raios solares. Isso pode contribuir para temperaturas mais amenas.</w:t>
+      </w:r>
+    </w:p>
+    <w:p>
+      <w:pPr>
+        <w:spacing w:before="0" w:after="80" w:line="269" w:lineRule="auto"/>
+      </w:pPr>
+      <w:r>
+        <w:rPr>
+          <w:b/>
+          <w:sz w:val="22"/>
+        </w:rPr>
+        <w:t xml:space="preserve">Explique como a latitude influencia os climas brasileiros, citando o clima equatorial e o clima subtropical como exemplos.</w:t>
       </w:r>
     </w:p>
     <w:p>
@@ -536,31 +668,31 @@
           <w:b/>
           <w:sz w:val="26"/>
         </w:rPr>
-        <w:t xml:space="preserve">Questão 06</w:t>
-      </w:r>
-    </w:p>
-    <w:p>
-      <w:pPr>
-        <w:spacing w:before="0" w:after="80" w:line="269" w:lineRule="auto"/>
-      </w:pPr>
-      <w:r>
-        <w:rPr>
-          <w:b w:val="0"/>
-          <w:sz w:val="22"/>
-        </w:rPr>
-        <w:t xml:space="preserve">O Cerrado é um dos domínios morfoclimáticos brasileiros mais ameaçados atualmente. Ele se localiza principalmente na região central do Brasil e apresenta vegetação adaptada ao clima tropical típico.</w:t>
-      </w:r>
-    </w:p>
-    <w:p>
-      <w:pPr>
-        <w:spacing w:before="0" w:after="80" w:line="269" w:lineRule="auto"/>
-      </w:pPr>
-      <w:r>
-        <w:rPr>
-          <w:b/>
-          <w:sz w:val="22"/>
-        </w:rPr>
-        <w:t xml:space="preserve">Cite duas características naturais do Cerrado e dois problemas ambientais que esse domínio enfrenta atualmente.</w:t>
+        <w:t xml:space="preserve">Questão 08</w:t>
+      </w:r>
+    </w:p>
+    <w:p>
+      <w:pPr>
+        <w:spacing w:before="0" w:after="80" w:line="269" w:lineRule="auto"/>
+      </w:pPr>
+      <w:r>
+        <w:rPr>
+          <w:b w:val="0"/>
+          <w:sz w:val="22"/>
+        </w:rPr>
+        <w:t xml:space="preserve">A hidrografia brasileira pode ser estudada por meio dos conceitos de bacia hidrográfica e região hidrográfica.</w:t>
+      </w:r>
+    </w:p>
+    <w:p>
+      <w:pPr>
+        <w:spacing w:before="0" w:after="80" w:line="269" w:lineRule="auto"/>
+      </w:pPr>
+      <w:r>
+        <w:rPr>
+          <w:b/>
+          <w:sz w:val="22"/>
+        </w:rPr>
+        <w:t xml:space="preserve">Explique a diferença entre bacia hidrográfica e região hidrográfica.</w:t>
       </w:r>
     </w:p>
     <w:p>
@@ -620,50 +752,31 @@
           <w:b/>
           <w:sz w:val="26"/>
         </w:rPr>
-        <w:t xml:space="preserve">Questão 07</w:t>
-      </w:r>
-    </w:p>
-    <w:p>
-      <w:pPr>
-        <w:spacing w:before="0" w:after="80" w:line="269" w:lineRule="auto"/>
-      </w:pPr>
-      <w:r>
-        <w:rPr>
-          <w:b w:val="0"/>
-          <w:sz w:val="22"/>
-        </w:rPr>
-        <w:t xml:space="preserve">Leia o trecho abaixo:</w:t>
-      </w:r>
-    </w:p>
-    <w:p>
-      <w:pPr>
-        <w:spacing w:before="0" w:after="80" w:line="269" w:lineRule="auto"/>
-      </w:pPr>
-      <w:r>
-        <w:rPr>
-          <w:b w:val="0"/>
-          <w:sz w:val="22"/>
-        </w:rPr>
-        <w:t xml:space="preserve">&gt; Quanto mais próxima uma área está da Linha do Equador, maior tende a ser a incidência direta dos raios solares. Já em áreas mais afastadas do Equador, a radiação chega de forma mais inclinada, o que contribui para temperaturas menores.</w:t>
-      </w:r>
-    </w:p>
-    <w:p>
-      <w:pPr>
-        <w:spacing w:before="0" w:after="80" w:line="269" w:lineRule="auto"/>
-      </w:pPr>
-      <w:r>
-        <w:rPr>
-          <w:b w:val="0"/>
-          <w:sz w:val="22"/>
-        </w:rPr>
-        <w:t xml:space="preserve">Com base no texto, </w:t>
-      </w:r>
-      <w:r>
-        <w:rPr>
-          <w:b/>
-          <w:sz w:val="22"/>
-        </w:rPr>
-        <w:t xml:space="preserve">explique como a latitude influencia os diferentes tipos climáticos brasileiros, citando um exemplo de clima quente e um exemplo de clima mais ameno.</w:t>
+        <w:t xml:space="preserve">Questão 09</w:t>
+      </w:r>
+    </w:p>
+    <w:p>
+      <w:pPr>
+        <w:spacing w:before="0" w:after="80" w:line="269" w:lineRule="auto"/>
+      </w:pPr>
+      <w:r>
+        <w:rPr>
+          <w:b w:val="0"/>
+          <w:sz w:val="22"/>
+        </w:rPr>
+        <w:t xml:space="preserve">O Brasil é dividido em 12 regiões hidrográficas para auxiliar o planejamento e a gestão dos recursos hídricos.</w:t>
+      </w:r>
+    </w:p>
+    <w:p>
+      <w:pPr>
+        <w:spacing w:before="0" w:after="80" w:line="269" w:lineRule="auto"/>
+      </w:pPr>
+      <w:r>
+        <w:rPr>
+          <w:b/>
+          <w:sz w:val="22"/>
+        </w:rPr>
+        <w:t xml:space="preserve">Explique por que essa divisão pode ajudar na criação de políticas públicas relacionadas à água.</w:t>
       </w:r>
     </w:p>
     <w:p>
@@ -723,202 +836,6 @@
           <w:b/>
           <w:sz w:val="26"/>
         </w:rPr>
-        <w:t xml:space="preserve">Questão 08</w:t>
-      </w:r>
-    </w:p>
-    <w:p>
-      <w:pPr>
-        <w:spacing w:before="0" w:after="80" w:line="269" w:lineRule="auto"/>
-      </w:pPr>
-      <w:r>
-        <w:rPr>
-          <w:b w:val="0"/>
-          <w:sz w:val="22"/>
-        </w:rPr>
-        <w:t xml:space="preserve">A hidrografia brasileira pode ser estudada por meio de dois conceitos importantes: </w:t>
-      </w:r>
-      <w:r>
-        <w:rPr>
-          <w:b/>
-          <w:sz w:val="22"/>
-        </w:rPr>
-        <w:t xml:space="preserve">bacia hidrográfica</w:t>
-      </w:r>
-      <w:r>
-        <w:rPr>
-          <w:b w:val="0"/>
-          <w:sz w:val="22"/>
-        </w:rPr>
-        <w:t xml:space="preserve"> e </w:t>
-      </w:r>
-      <w:r>
-        <w:rPr>
-          <w:b/>
-          <w:sz w:val="22"/>
-        </w:rPr>
-        <w:t xml:space="preserve">região hidrográfica</w:t>
-      </w:r>
-      <w:r>
-        <w:rPr>
-          <w:b w:val="0"/>
-          <w:sz w:val="22"/>
-        </w:rPr>
-        <w:t xml:space="preserve">.</w:t>
-      </w:r>
-    </w:p>
-    <w:p>
-      <w:pPr>
-        <w:spacing w:before="0" w:after="80" w:line="269" w:lineRule="auto"/>
-      </w:pPr>
-      <w:r>
-        <w:rPr>
-          <w:b/>
-          <w:sz w:val="22"/>
-        </w:rPr>
-        <w:t xml:space="preserve">Explique a diferença entre bacia hidrográfica e região hidrográfica.</w:t>
-      </w:r>
-    </w:p>
-    <w:p>
-      <w:pPr>
-        <w:spacing w:before="0" w:after="40" w:line="269" w:lineRule="auto"/>
-      </w:pPr>
-      <w:r>
-        <w:rPr>
-          <w:b/>
-          <w:sz w:val="20"/>
-        </w:rPr>
-        <w:t xml:space="preserve">Resposta:</w:t>
-      </w:r>
-    </w:p>
-    <w:p>
-      <w:pPr>
-        <w:spacing w:before="0" w:after="20" w:line="269" w:lineRule="auto"/>
-      </w:pPr>
-      <w:r>
-        <w:rPr>
-          <w:b w:val="0"/>
-          <w:sz w:val="20"/>
-        </w:rPr>
-        <w:t xml:space="preserve">_____________________________________________________________________________________________</w:t>
-      </w:r>
-    </w:p>
-    <w:p>
-      <w:pPr>
-        <w:spacing w:before="0" w:after="20" w:line="269" w:lineRule="auto"/>
-      </w:pPr>
-      <w:r>
-        <w:rPr>
-          <w:b w:val="0"/>
-          <w:sz w:val="20"/>
-        </w:rPr>
-        <w:t xml:space="preserve">_____________________________________________________________________________________________</w:t>
-      </w:r>
-    </w:p>
-    <w:p>
-      <w:pPr>
-        <w:spacing w:before="0" w:after="20" w:line="269" w:lineRule="auto"/>
-      </w:pPr>
-      <w:r>
-        <w:rPr>
-          <w:b w:val="0"/>
-          <w:sz w:val="20"/>
-        </w:rPr>
-        <w:t xml:space="preserve">_____________________________________________________________________________________________</w:t>
-      </w:r>
-    </w:p>
-    <w:p>
-      <w:pPr>
-        <w:spacing w:before="200" w:after="80" w:line="269" w:lineRule="auto"/>
-      </w:pPr>
-      <w:r>
-        <w:rPr>
-          <w:b/>
-          <w:sz w:val="26"/>
-        </w:rPr>
-        <w:t xml:space="preserve">Questão 09</w:t>
-      </w:r>
-    </w:p>
-    <w:p>
-      <w:pPr>
-        <w:spacing w:before="0" w:after="80" w:line="269" w:lineRule="auto"/>
-      </w:pPr>
-      <w:r>
-        <w:rPr>
-          <w:b w:val="0"/>
-          <w:sz w:val="22"/>
-        </w:rPr>
-        <w:t xml:space="preserve">O Brasil é dividido em 12 regiões hidrográficas. Essa divisão não considera apenas a água dos rios, mas também aspectos sociais e econômicos relacionados ao uso da água.</w:t>
-      </w:r>
-    </w:p>
-    <w:p>
-      <w:pPr>
-        <w:spacing w:before="0" w:after="80" w:line="269" w:lineRule="auto"/>
-      </w:pPr>
-      <w:r>
-        <w:rPr>
-          <w:b/>
-          <w:sz w:val="22"/>
-        </w:rPr>
-        <w:t xml:space="preserve">Explique por que a divisão em regiões hidrográficas pode ajudar na criação de políticas públicas.</w:t>
-      </w:r>
-    </w:p>
-    <w:p>
-      <w:pPr>
-        <w:spacing w:before="0" w:after="40" w:line="269" w:lineRule="auto"/>
-      </w:pPr>
-      <w:r>
-        <w:rPr>
-          <w:b/>
-          <w:sz w:val="20"/>
-        </w:rPr>
-        <w:t xml:space="preserve">Resposta:</w:t>
-      </w:r>
-    </w:p>
-    <w:p>
-      <w:pPr>
-        <w:spacing w:before="0" w:after="20" w:line="269" w:lineRule="auto"/>
-      </w:pPr>
-      <w:r>
-        <w:rPr>
-          <w:b w:val="0"/>
-          <w:sz w:val="20"/>
-        </w:rPr>
-        <w:t xml:space="preserve">_____________________________________________________________________________________________</w:t>
-      </w:r>
-    </w:p>
-    <w:p>
-      <w:pPr>
-        <w:spacing w:before="0" w:after="20" w:line="269" w:lineRule="auto"/>
-      </w:pPr>
-      <w:r>
-        <w:rPr>
-          <w:b w:val="0"/>
-          <w:sz w:val="20"/>
-        </w:rPr>
-        <w:t xml:space="preserve">_____________________________________________________________________________________________</w:t>
-      </w:r>
-    </w:p>
-    <w:p>
-      <w:pPr>
-        <w:spacing w:before="0" w:after="20" w:line="269" w:lineRule="auto"/>
-      </w:pPr>
-      <w:r>
-        <w:rPr>
-          <w:b w:val="0"/>
-          <w:sz w:val="20"/>
-        </w:rPr>
-        <w:t xml:space="preserve">_____________________________________________________________________________________________</w:t>
-      </w:r>
-    </w:p>
-    <w:p>
-      <w:pPr>
-        <w:spacing w:before="200" w:after="80" w:line="269" w:lineRule="auto"/>
-      </w:pPr>
-      <w:r>
-        <w:rPr>
-          <w:b/>
-          <w:sz w:val="26"/>
-        </w:rPr>
         <w:t xml:space="preserve">Questão de Excelência</w:t>
       </w:r>
     </w:p>
@@ -934,143 +851,152 @@
         <w:t xml:space="preserve">Observe o esquema abaixo:</w:t>
       </w:r>
     </w:p>
-    <w:p>
-      <w:pPr>
-        <w:spacing w:before="0" w:after="20" w:line="269" w:lineRule="auto"/>
-      </w:pPr>
-      <w:r>
-        <w:rPr>
-          <w:b w:val="0"/>
-          <w:sz w:val="20"/>
-        </w:rPr>
-        <w:t xml:space="preserve">ELEMENTOS NATURAIS</w:t>
-      </w:r>
-    </w:p>
-    <w:p>
-      <w:pPr>
-        <w:spacing w:before="0" w:after="20" w:line="269" w:lineRule="auto"/>
-      </w:pPr>
-      <w:r>
-        <w:rPr>
-          <w:b w:val="0"/>
-          <w:sz w:val="20"/>
-        </w:rPr>
-        <w:t xml:space="preserve">clima + relevo + solo + vegetação + hidrografia</w:t>
-      </w:r>
-    </w:p>
-    <w:p>
-      <w:pPr>
-        <w:spacing w:before="0" w:after="20" w:line="269" w:lineRule="auto"/>
-      </w:pPr>
-      <w:r>
-        <w:rPr>
-          <w:b w:val="0"/>
-          <w:sz w:val="20"/>
-        </w:rPr>
-        <w:t xml:space="preserve">          ↓</w:t>
-      </w:r>
-    </w:p>
-    <w:p>
-      <w:pPr>
-        <w:spacing w:before="0" w:after="20" w:line="269" w:lineRule="auto"/>
-      </w:pPr>
-      <w:r>
-        <w:rPr>
-          <w:b w:val="0"/>
-          <w:sz w:val="20"/>
-        </w:rPr>
-        <w:t xml:space="preserve">DOMÍNIOS MORFOCLIMÁTICOS</w:t>
-      </w:r>
-    </w:p>
-    <w:p>
-      <w:pPr>
-        <w:spacing w:before="0" w:after="20" w:line="269" w:lineRule="auto"/>
-      </w:pPr>
-      <w:r>
-        <w:rPr>
-          <w:b w:val="0"/>
-          <w:sz w:val="20"/>
-        </w:rPr>
-        <w:t xml:space="preserve">          ↓</w:t>
-      </w:r>
-    </w:p>
-    <w:p>
-      <w:pPr>
-        <w:spacing w:before="0" w:after="20" w:line="269" w:lineRule="auto"/>
-      </w:pPr>
-      <w:r>
-        <w:rPr>
-          <w:b w:val="0"/>
-          <w:sz w:val="20"/>
-        </w:rPr>
-        <w:t xml:space="preserve">Exemplo: Cerrado</w:t>
-      </w:r>
-    </w:p>
-    <w:p>
-      <w:pPr>
-        <w:spacing w:before="0" w:after="20" w:line="269" w:lineRule="auto"/>
-      </w:pPr>
-      <w:r>
-        <w:rPr>
-          <w:b w:val="0"/>
-          <w:sz w:val="20"/>
-        </w:rPr>
-        <w:t xml:space="preserve">clima tropical típico + estação seca + vegetação adaptada + rios e solos do Brasil central</w:t>
-      </w:r>
-    </w:p>
-    <w:p>
-      <w:pPr>
-        <w:spacing w:before="0" w:after="20" w:line="269" w:lineRule="auto"/>
-      </w:pPr>
-      <w:r>
-        <w:rPr>
-          <w:b w:val="0"/>
-          <w:sz w:val="20"/>
-        </w:rPr>
-        <w:t xml:space="preserve">          ↓</w:t>
-      </w:r>
-    </w:p>
-    <w:p>
-      <w:pPr>
-        <w:spacing w:before="0" w:after="20" w:line="269" w:lineRule="auto"/>
-      </w:pPr>
-      <w:r>
-        <w:rPr>
-          <w:b w:val="0"/>
-          <w:sz w:val="20"/>
-        </w:rPr>
-        <w:t xml:space="preserve">PROBLEMAS ATUAIS</w:t>
-      </w:r>
-    </w:p>
-    <w:p>
-      <w:pPr>
-        <w:spacing w:before="0" w:after="20" w:line="269" w:lineRule="auto"/>
-      </w:pPr>
-      <w:r>
-        <w:rPr>
-          <w:b w:val="0"/>
-          <w:sz w:val="20"/>
-        </w:rPr>
-        <w:t xml:space="preserve">avanço da agropecuária + queimadas + perda de biodiversidade</w:t>
-      </w:r>
-    </w:p>
-    <w:p>
-      <w:pPr>
-        <w:spacing w:before="0" w:after="80" w:line="269" w:lineRule="auto"/>
-      </w:pPr>
-      <w:r>
-        <w:rPr>
-          <w:b w:val="0"/>
-          <w:sz w:val="22"/>
-        </w:rPr>
-        <w:t xml:space="preserve">Com base no esquema, </w:t>
-      </w:r>
-      <w:r>
-        <w:rPr>
-          <w:b/>
-          <w:sz w:val="22"/>
-        </w:rPr>
-        <w:t xml:space="preserve">explique por que o Cerrado pode ser entendido como um domínio morfoclimático e por que ele é considerado uma área ameaçada.</w:t>
+    <w:tbl>
+      <w:tblPr>
+        <w:tblW w:w="7600" w:type="dxa"/>
+        <w:jc w:val="center"/>
+        <w:tblBorders>
+          <w:top w:val="single" w:sz="5" w:space="0" w:color="000000"/>
+          <w:left w:val="single" w:sz="5" w:space="0" w:color="000000"/>
+          <w:bottom w:val="single" w:sz="5" w:space="0" w:color="000000"/>
+          <w:right w:val="single" w:sz="5" w:space="0" w:color="000000"/>
+        </w:tblBorders>
+        <w:tblCellMar>
+          <w:top w:w="180" w:type="dxa"/>
+          <w:left w:w="260" w:type="dxa"/>
+          <w:bottom w:w="180" w:type="dxa"/>
+          <w:right w:w="260" w:type="dxa"/>
+        </w:tblCellMar>
+      </w:tblPr>
+      <w:tblGrid>
+        <w:gridCol w:w="7600"/>
+      </w:tblGrid>
+      <w:tr>
+        <w:tc>
+          <w:tcPr>
+            <w:tcW w:w="7600" w:type="dxa"/>
+          </w:tcPr>
+          <w:p>
+            <w:pPr>
+              <w:spacing w:before="0" w:after="20" w:line="269" w:lineRule="auto"/>
+            </w:pPr>
+            <w:r>
+              <w:rPr>
+                <w:b w:val="0"/>
+                <w:sz w:val="20"/>
+              </w:rPr>
+              <w:t xml:space="preserve">DOMÍNIOS MORFOCLIMÁTICOS</w:t>
+            </w:r>
+          </w:p>
+          <w:p>
+            <w:pPr>
+              <w:spacing w:before="0" w:after="20" w:line="269" w:lineRule="auto"/>
+            </w:pPr>
+            <w:r>
+              <w:rPr>
+                <w:b w:val="0"/>
+                <w:sz w:val="20"/>
+              </w:rPr>
+              <w:t xml:space="preserve">clima + vegetação + relevo + solo + hidrografia</w:t>
+            </w:r>
+          </w:p>
+          <w:p>
+            <w:pPr>
+              <w:spacing w:before="0" w:after="20" w:line="269" w:lineRule="auto"/>
+            </w:pPr>
+            <w:r>
+              <w:rPr>
+                <w:b w:val="0"/>
+                <w:sz w:val="20"/>
+              </w:rPr>
+              <w:t xml:space="preserve">        ↓</w:t>
+            </w:r>
+          </w:p>
+          <w:p>
+            <w:pPr>
+              <w:spacing w:before="0" w:after="20" w:line="269" w:lineRule="auto"/>
+            </w:pPr>
+            <w:r>
+              <w:rPr>
+                <w:b w:val="0"/>
+                <w:sz w:val="20"/>
+              </w:rPr>
+              <w:t xml:space="preserve">exemplo: Cerrado</w:t>
+            </w:r>
+          </w:p>
+          <w:p>
+            <w:pPr>
+              <w:spacing w:before="0" w:after="20" w:line="269" w:lineRule="auto"/>
+            </w:pPr>
+            <w:r>
+              <w:rPr>
+                <w:b w:val="0"/>
+                <w:sz w:val="20"/>
+              </w:rPr>
+              <w:t xml:space="preserve">        ↓</w:t>
+            </w:r>
+          </w:p>
+          <w:p>
+            <w:pPr>
+              <w:spacing w:before="0" w:after="20" w:line="269" w:lineRule="auto"/>
+            </w:pPr>
+            <w:r>
+              <w:rPr>
+                <w:b w:val="0"/>
+                <w:sz w:val="20"/>
+              </w:rPr>
+              <w:t xml:space="preserve">clima tropical típico + estação seca + vegetação adaptada</w:t>
+            </w:r>
+          </w:p>
+          <w:p>
+            <w:pPr>
+              <w:spacing w:before="0" w:after="20" w:line="269" w:lineRule="auto"/>
+            </w:pPr>
+            <w:r>
+              <w:rPr>
+                <w:b w:val="0"/>
+                <w:sz w:val="20"/>
+              </w:rPr>
+              <w:t xml:space="preserve">        ↓</w:t>
+            </w:r>
+          </w:p>
+          <w:p>
+            <w:pPr>
+              <w:spacing w:before="0" w:after="20" w:line="269" w:lineRule="auto"/>
+            </w:pPr>
+            <w:r>
+              <w:rPr>
+                <w:b w:val="0"/>
+                <w:sz w:val="20"/>
+              </w:rPr>
+              <w:t xml:space="preserve">avanço da agropecuária + queimadas + perda de biodiversidade</w:t>
+            </w:r>
+          </w:p>
+        </w:tc>
+      </w:tr>
+    </w:tbl>
+    <w:p>
+      <w:pPr>
+        <w:spacing w:before="0" w:after="80" w:line="269" w:lineRule="auto"/>
+      </w:pPr>
+    </w:p>
+    <w:p>
+      <w:pPr>
+        <w:spacing w:before="0" w:after="80" w:line="269" w:lineRule="auto"/>
+      </w:pPr>
+      <w:r>
+        <w:rPr>
+          <w:b w:val="0"/>
+          <w:sz w:val="22"/>
+        </w:rPr>
+        <w:t xml:space="preserve">Com base no esquema e nos conceitos estudados, </w:t>
+      </w:r>
+      <w:r>
+        <w:rPr>
+          <w:b/>
+          <w:sz w:val="22"/>
+        </w:rPr>
+        <w:t xml:space="preserve">explique por que o Cerrado pode ser entendido como domínio morfoclimático e por que ele é considerado uma área ameaçada.</w:t>
       </w:r>
     </w:p>
     <w:p>
@@ -1182,7 +1108,7 @@
           <w:b w:val="0"/>
           <w:sz w:val="22"/>
         </w:rPr>
-        <w:t xml:space="preserve">Domínios morfoclimáticos são grandes áreas naturais em que diferentes elementos da paisagem se relacionam, formando características semelhantes. O aluno pode citar clima, relevo, solo, vegetação e hidrografia.</w:t>
+        <w:t xml:space="preserve">Domínios morfoclimáticos são grandes áreas naturais em que elementos como clima, vegetação, hidrografia, relevo e solo se relacionam, formando paisagens com características semelhantes.</w:t>
       </w:r>
     </w:p>
     <w:p>
@@ -1206,7 +1132,7 @@
           <w:b w:val="0"/>
           <w:sz w:val="22"/>
         </w:rPr>
-        <w:t xml:space="preserve">A resposta deve mostrar que não se trata apenas de vegetação ou bioma, mas de uma combinação de elementos naturais interrelacionados.</w:t>
+        <w:t xml:space="preserve">A resposta deve mostrar que domínio morfoclimático envolve a interrelação de vários elementos naturais, não apenas vegetação.</w:t>
       </w:r>
     </w:p>
     <w:p>
@@ -1242,7 +1168,7 @@
           <w:b w:val="0"/>
           <w:sz w:val="22"/>
         </w:rPr>
-        <w:t xml:space="preserve">São as zonas de transição. Elas existem porque, entre um domínio e outro, há áreas com características misturadas, sem predomínio totalmente claro de apenas um domínio.</w:t>
+        <w:t xml:space="preserve">São zonas de transição. Elas existem porque a passagem entre dois domínios pode ser gradual, misturando características de ambos.</w:t>
       </w:r>
     </w:p>
     <w:p>
@@ -1266,7 +1192,7 @@
           <w:b w:val="0"/>
           <w:sz w:val="22"/>
         </w:rPr>
-        <w:t xml:space="preserve">O ponto principal é reconhecer que a passagem entre domínios não é sempre brusca; pode ser gradual.</w:t>
+        <w:t xml:space="preserve">A resposta deve indicar que os limites naturais não são sempre bruscos.</w:t>
       </w:r>
     </w:p>
     <w:p>
@@ -1302,7 +1228,7 @@
           <w:b w:val="0"/>
           <w:sz w:val="22"/>
         </w:rPr>
-        <w:t xml:space="preserve">O clima descrito é o equatorial. O fator climático mais importante é a latitude, pois a proximidade da Linha do Equador aumenta a incidência de radiação solar, mantendo temperaturas elevadas.</w:t>
+        <w:t xml:space="preserve">O clima descrito é o equatorial. O fator climático mais importante é a latitude, pois a proximidade da Linha do Equador aumenta a incidência solar direta, mantendo temperaturas elevadas.</w:t>
       </w:r>
     </w:p>
     <w:p>
@@ -1326,7 +1252,7 @@
           <w:b w:val="0"/>
           <w:sz w:val="22"/>
         </w:rPr>
-        <w:t xml:space="preserve">A resposta deve associar clima equatorial, calor, chuva abundante e baixa latitude.</w:t>
+        <w:t xml:space="preserve">A resposta deve associar clima equatorial, calor, chuvas abundantes e baixa latitude.</w:t>
       </w:r>
     </w:p>
     <w:p>
@@ -1362,31 +1288,7 @@
           <w:b w:val="0"/>
           <w:sz w:val="22"/>
         </w:rPr>
-        <w:t xml:space="preserve">a. Tropical típico: ocorre mais no interior, com influência da continentalidade, e apresenta estação seca e estação chuvosa bem definidas.</w:t>
-      </w:r>
-    </w:p>
-    <w:p>
-      <w:pPr>
-        <w:spacing w:before="0" w:after="80" w:line="269" w:lineRule="auto"/>
-      </w:pPr>
-      <w:r>
-        <w:rPr>
-          <w:b w:val="0"/>
-          <w:sz w:val="22"/>
-        </w:rPr>
-        <w:t xml:space="preserve">b. Tropical litorâneo: ocorre no litoral, recebe mais umidade do oceano por causa da maritimidade e tende a ter maior umidade.</w:t>
-      </w:r>
-    </w:p>
-    <w:p>
-      <w:pPr>
-        <w:spacing w:before="0" w:after="80" w:line="269" w:lineRule="auto"/>
-      </w:pPr>
-      <w:r>
-        <w:rPr>
-          <w:b w:val="0"/>
-          <w:sz w:val="22"/>
-        </w:rPr>
-        <w:t xml:space="preserve">c. Tropical de altitude: ocorre em áreas mais elevadas, onde a altitude contribui para temperaturas mais amenas.</w:t>
+        <w:t xml:space="preserve">O tropical típico ocorre mais no interior e tem influência da continentalidade, com estação seca e chuvosa bem marcadas. O tropical litorâneo sofre influência da maritimidade, recebendo mais umidade do oceano. O tropical de altitude ocorre em áreas elevadas, onde a altitude reduz as temperaturas.</w:t>
       </w:r>
     </w:p>
     <w:p>
@@ -1410,7 +1312,7 @@
           <w:b w:val="0"/>
           <w:sz w:val="22"/>
         </w:rPr>
-        <w:t xml:space="preserve">O aluno deve diferenciar os três tipos tropicais pelo fator climático predominante.</w:t>
+        <w:t xml:space="preserve">A resposta deve diferenciar os três tipos tropicais pelo fator climático predominante.</w:t>
       </w:r>
     </w:p>
     <w:p>
@@ -1446,7 +1348,7 @@
           <w:b w:val="0"/>
           <w:sz w:val="22"/>
         </w:rPr>
-        <w:t xml:space="preserve">A continentalidade influencia áreas mais afastadas do mar, favorecendo maior variação térmica e estações seca e úmida mais marcadas. A maritimidade influencia áreas próximas ao oceano, aumentando a umidade e reduzindo a variação de temperatura.</w:t>
+        <w:t xml:space="preserve">A continentalidade influencia áreas distantes do mar, favorecendo maior contraste entre estação seca e chuvosa. A maritimidade influencia áreas próximas ao oceano, aumentando a umidade e reduzindo a variação de temperatura.</w:t>
       </w:r>
     </w:p>
     <w:p>
@@ -1506,7 +1408,7 @@
           <w:b w:val="0"/>
           <w:sz w:val="22"/>
         </w:rPr>
-        <w:t xml:space="preserve">Características naturais: clima tropical típico, estação seca e chuvosa, vegetação adaptada, árvores espaçadas, raízes profundas. Problemas ambientais: avanço da agropecuária, queimadas, desmatamento e perda de biodiversidade.</w:t>
+        <w:t xml:space="preserve">Características naturais: clima tropical típico, estação seca e chuvosa, árvores espaçadas, vegetação adaptada e raízes profundas. Problemas ambientais: avanço da agropecuária, queimadas, desmatamento e perda de biodiversidade.</w:t>
       </w:r>
     </w:p>
     <w:p>
@@ -1530,7 +1432,7 @@
           <w:b w:val="0"/>
           <w:sz w:val="22"/>
         </w:rPr>
-        <w:t xml:space="preserve">A questão exige dois elementos naturais e dois problemas atuais. Respostas equivalentes são aceitáveis.</w:t>
+        <w:t xml:space="preserve">A resposta deve trazer duas características naturais e dois problemas ambientais.</w:t>
       </w:r>
     </w:p>
     <w:p>
@@ -1566,7 +1468,7 @@
           <w:b w:val="0"/>
           <w:sz w:val="22"/>
         </w:rPr>
-        <w:t xml:space="preserve">A latitude influencia a quantidade de radiação solar recebida. Áreas próximas ao Equador recebem raios solares mais diretos e tendem a ser mais quentes, como no clima equatorial. Áreas mais afastadas do Equador tendem a ter temperaturas mais amenas, como no clima subtropical.</w:t>
+        <w:t xml:space="preserve">A latitude influencia a quantidade de radiação solar recebida. O clima equatorial ocorre próximo à Linha do Equador, com altas temperaturas. O clima subtropical ocorre em latitudes mais altas, com temperaturas mais amenas.</w:t>
       </w:r>
     </w:p>
     <w:p>
@@ -1590,7 +1492,7 @@
           <w:b w:val="0"/>
           <w:sz w:val="22"/>
         </w:rPr>
-        <w:t xml:space="preserve">A resposta deve ligar latitude à incidência solar e comparar pelo menos dois tipos climáticos.</w:t>
+        <w:t xml:space="preserve">A resposta deve comparar os climas a partir da distância em relação à Linha do Equador.</w:t>
       </w:r>
     </w:p>
     <w:p>
@@ -1650,7 +1552,7 @@
           <w:b w:val="0"/>
           <w:sz w:val="22"/>
         </w:rPr>
-        <w:t xml:space="preserve">O aluno deve perceber que bacia é um conceito mais natural/físico, enquanto região hidrográfica é mais ampla e útil para gestão.</w:t>
+        <w:t xml:space="preserve">A resposta deve diferenciar o conceito natural de bacia do conceito mais amplo de região hidrográfica.</w:t>
       </w:r>
     </w:p>
     <w:p>
@@ -1686,7 +1588,7 @@
           <w:b w:val="0"/>
           <w:sz w:val="22"/>
         </w:rPr>
-        <w:t xml:space="preserve">A divisão em regiões hidrográficas ajuda na criação de políticas públicas porque permite planejar o uso da água considerando rios, população, cidades, atividades econômicas, abastecimento, impactos ambientais e comunidades que dependem desses recursos.</w:t>
+        <w:t xml:space="preserve">Essa divisão ajuda nas políticas públicas porque permite planejar o uso da água considerando rios, cidades, população, atividades econômicas, abastecimento, impactos ambientais e comunidades que dependem dos recursos hídricos.</w:t>
       </w:r>
     </w:p>
     <w:p>
@@ -1710,7 +1612,7 @@
           <w:b w:val="0"/>
           <w:sz w:val="22"/>
         </w:rPr>
-        <w:t xml:space="preserve">A resposta deve relacionar regiões hidrográficas com planejamento, gestão da água e tomada de decisões.</w:t>
+        <w:t xml:space="preserve">A resposta deve relacionar regiões hidrográficas com gestão da água e tomada de decisões.</w:t>
       </w:r>
     </w:p>
     <w:p>
@@ -1746,7 +1648,7 @@
           <w:b w:val="0"/>
           <w:sz w:val="22"/>
         </w:rPr>
-        <w:t xml:space="preserve">O Cerrado é um domínio morfoclimático porque reúne elementos naturais interrelacionados, como clima tropical típico, vegetação adaptada à seca, relevo, solos e hidrografia do Brasil central. Ele é ameaçado pelo avanço da agropecuária, pelas queimadas, pelo desmatamento e pela perda de biodiversidade.</w:t>
+        <w:t xml:space="preserve">O Cerrado é um domínio morfoclimático porque reúne elementos naturais interrelacionados, como clima tropical típico, vegetação adaptada, relevo, solo e hidrografia. Ele é ameaçado pelo avanço da agropecuária, pelas queimadas, pelo desmatamento e pela perda de biodiversidade.</w:t>
       </w:r>
     </w:p>
     <w:p>
@@ -1770,7 +1672,7 @@
           <w:b w:val="0"/>
           <w:sz w:val="22"/>
         </w:rPr>
-        <w:t xml:space="preserve">A resposta deve integrar conceito de domínio morfoclimático, características do Cerrado e problemas ambientais atuais. Não basta apenas citar que “é seco” ou que “tem árvores”.</w:t>
+        <w:t xml:space="preserve">A resposta deve integrar conceito de domínio morfoclimático, características do Cerrado e problemas ambientais atuais.</w:t>
       </w:r>
     </w:p>
     <w:sectPr>

</xml_diff>